<commit_message>
Address review: add debt service to cash flow, align operating-day narrative
Codex review on PR #2:
- Cash flow now includes loan interest and principal repayment as
  Year-1 cash outflows (new "Срок кредита (лет)" assumption, straight-line
  paydown consistent with the declining P&L interest). Added a memo line
  for accrued Corporation Tax, noting it is paid in Year 2 (9 months after
  the accounting period ends), so it is correctly outside the Year-1 net
  flow. Year-1 ending cash stays positive (~£19k) after debt service.
- Aligned the operating-schedule wording in README, business plan (md +
  docx) with the model: ~7 days/week ≈ 332 operating days/year (with
  holidays/closures), not 365 — removing the ~£285k vs ~£312k discrepancy.

Co-Authored-By: Claude Opus 4.8 <noreply@anthropic.com>
Claude-Session: https://claude.ai/code/session_01PetgqhPEPFmBEho5MNCqhp
</commit_message>
<xml_diff>
--- a/shawarma-london/Бизнес-план.docx
+++ b/shawarma-london/Бизнес-план.docx
@@ -337,7 +337,7 @@
         <w:pStyle w:val="ListBullet"/>
       </w:pPr>
       <w:r>
-        <w:t>Формат точки: киоск/контейнер несколько кв. м, takeaway, 7 дней в неделю, ~12 ч/день (10:00–22:00).</w:t>
+        <w:t>Формат точки: киоск/контейнер несколько кв. м, takeaway, ~7 дней в неделю, ~12 ч/день (10:00–22:00). В модели заложено ~332 операционных дня в год (с учётом праздников/закрытий), а не 365.</w:t>
       </w:r>
     </w:p>
     <w:p>
@@ -856,7 +856,7 @@
           <w:b w:val="0"/>
           <w:i w:val="0"/>
         </w:rPr>
-        <w:t>Модель считает P&amp;L на 3 года, помесячный cash flow, точку безубыточности и сценарии (пессимистичный / базовый / оптимистичный). Все ставки — параметры на листе «Допущения» со ссылками на источники (см. «Источники.md»).</w:t>
+        <w:t>Модель считает P&amp;L на 3 года, помесячный cash flow (с обслуживанием кредита — проценты и погашение тела — и квартальным НДС; Corporation tax уплачивается в Год 2, через 9 мес после конца года), точку безубыточности и сценарии (пессимистичный / базовый / оптимистичный). Все ставки — параметры на листе «Допущения» со ссылками на источники (см. «Источники.md»).</w:t>
       </w:r>
     </w:p>
     <w:p>

</xml_diff>